<commit_message>
feat: Lab04 is done, fix: Lab03 report header fix
</commit_message>
<xml_diff>
--- a/Lab03/Lab03_Neural-Networks.docx
+++ b/Lab03/Lab03_Neural-Networks.docx
@@ -28,7 +28,7 @@
           <w:szCs w:val="28"/>
           <w:lang w:val="ru-RU"/>
         </w:rPr>
-        <w:t>2</w:t>
+        <w:t>3</w:t>
       </w:r>
     </w:p>
     <w:p>
@@ -5358,261 +5358,251 @@
         </w:rPr>
         <w:t xml:space="preserve">: </w:t>
       </w:r>
-      <w:r>
-        <w:fldChar w:fldCharType="begin"/>
-      </w:r>
-      <w:r>
-        <w:instrText>HYPERLINK "https://drive.google.com/file/d/1hvcU88JyLGeU65K9t6Lo-czU3rQ3Bggb/view?usp=sharing"</w:instrText>
-      </w:r>
-      <w:r>
-        <w:fldChar w:fldCharType="separate"/>
-      </w:r>
-      <w:r>
-        <w:rPr>
-          <w:rStyle w:val="Hyperlink"/>
-          <w:lang w:val="en-GB"/>
-        </w:rPr>
-        <w:t>https</w:t>
-      </w:r>
-      <w:r>
-        <w:rPr>
-          <w:rStyle w:val="Hyperlink"/>
-          <w:lang w:val="ru-RU"/>
-        </w:rPr>
-        <w:t>://</w:t>
-      </w:r>
-      <w:r>
-        <w:rPr>
-          <w:rStyle w:val="Hyperlink"/>
-          <w:lang w:val="en-GB"/>
-        </w:rPr>
-        <w:t>drive</w:t>
-      </w:r>
-      <w:r>
-        <w:rPr>
-          <w:rStyle w:val="Hyperlink"/>
-          <w:lang w:val="ru-RU"/>
-        </w:rPr>
-        <w:t>.</w:t>
-      </w:r>
-      <w:r>
-        <w:rPr>
-          <w:rStyle w:val="Hyperlink"/>
-          <w:lang w:val="en-GB"/>
-        </w:rPr>
-        <w:t>google</w:t>
-      </w:r>
-      <w:r>
-        <w:rPr>
-          <w:rStyle w:val="Hyperlink"/>
-          <w:lang w:val="ru-RU"/>
-        </w:rPr>
-        <w:t>.</w:t>
-      </w:r>
-      <w:r>
-        <w:rPr>
-          <w:rStyle w:val="Hyperlink"/>
-          <w:lang w:val="en-GB"/>
-        </w:rPr>
-        <w:t>com</w:t>
-      </w:r>
-      <w:r>
-        <w:rPr>
-          <w:rStyle w:val="Hyperlink"/>
-          <w:lang w:val="ru-RU"/>
-        </w:rPr>
-        <w:t>/</w:t>
-      </w:r>
-      <w:r>
-        <w:rPr>
-          <w:rStyle w:val="Hyperlink"/>
-          <w:lang w:val="en-GB"/>
-        </w:rPr>
-        <w:t>file</w:t>
-      </w:r>
-      <w:r>
-        <w:rPr>
-          <w:rStyle w:val="Hyperlink"/>
-          <w:lang w:val="ru-RU"/>
-        </w:rPr>
-        <w:t>/</w:t>
-      </w:r>
-      <w:r>
-        <w:rPr>
-          <w:rStyle w:val="Hyperlink"/>
-          <w:lang w:val="en-GB"/>
-        </w:rPr>
-        <w:t>d</w:t>
-      </w:r>
-      <w:r>
-        <w:rPr>
-          <w:rStyle w:val="Hyperlink"/>
-          <w:lang w:val="ru-RU"/>
-        </w:rPr>
-        <w:t>/1</w:t>
-      </w:r>
-      <w:proofErr w:type="spellStart"/>
-      <w:r>
-        <w:rPr>
-          <w:rStyle w:val="Hyperlink"/>
-          <w:lang w:val="en-GB"/>
-        </w:rPr>
-        <w:t>hvcU</w:t>
-      </w:r>
-      <w:proofErr w:type="spellEnd"/>
-      <w:r>
-        <w:rPr>
-          <w:rStyle w:val="Hyperlink"/>
-          <w:lang w:val="ru-RU"/>
-        </w:rPr>
-        <w:t>88</w:t>
-      </w:r>
-      <w:proofErr w:type="spellStart"/>
-      <w:r>
-        <w:rPr>
-          <w:rStyle w:val="Hyperlink"/>
-          <w:lang w:val="en-GB"/>
-        </w:rPr>
-        <w:t>JyLGeU</w:t>
-      </w:r>
-      <w:proofErr w:type="spellEnd"/>
-      <w:r>
-        <w:rPr>
-          <w:rStyle w:val="Hyperlink"/>
-          <w:lang w:val="ru-RU"/>
-        </w:rPr>
-        <w:t>65</w:t>
-      </w:r>
-      <w:r>
-        <w:rPr>
-          <w:rStyle w:val="Hyperlink"/>
-          <w:lang w:val="en-GB"/>
-        </w:rPr>
-        <w:t>K</w:t>
-      </w:r>
-      <w:r>
-        <w:rPr>
-          <w:rStyle w:val="Hyperlink"/>
-          <w:lang w:val="ru-RU"/>
-        </w:rPr>
-        <w:t>9</w:t>
-      </w:r>
-      <w:r>
-        <w:rPr>
-          <w:rStyle w:val="Hyperlink"/>
-          <w:lang w:val="en-GB"/>
-        </w:rPr>
-        <w:t>t</w:t>
-      </w:r>
-      <w:r>
-        <w:rPr>
-          <w:rStyle w:val="Hyperlink"/>
-          <w:lang w:val="ru-RU"/>
-        </w:rPr>
-        <w:t>6</w:t>
-      </w:r>
-      <w:r>
-        <w:rPr>
-          <w:rStyle w:val="Hyperlink"/>
-          <w:lang w:val="en-GB"/>
-        </w:rPr>
-        <w:t>Lo</w:t>
-      </w:r>
-      <w:r>
-        <w:rPr>
-          <w:rStyle w:val="Hyperlink"/>
-          <w:lang w:val="ru-RU"/>
-        </w:rPr>
-        <w:t>-</w:t>
-      </w:r>
-      <w:proofErr w:type="spellStart"/>
-      <w:r>
-        <w:rPr>
-          <w:rStyle w:val="Hyperlink"/>
-          <w:lang w:val="en-GB"/>
-        </w:rPr>
-        <w:t>czU</w:t>
-      </w:r>
-      <w:proofErr w:type="spellEnd"/>
-      <w:r>
-        <w:rPr>
-          <w:rStyle w:val="Hyperlink"/>
-          <w:lang w:val="ru-RU"/>
-        </w:rPr>
-        <w:t>3</w:t>
-      </w:r>
-      <w:proofErr w:type="spellStart"/>
-      <w:r>
-        <w:rPr>
-          <w:rStyle w:val="Hyperlink"/>
-          <w:lang w:val="en-GB"/>
-        </w:rPr>
-        <w:t>rQ</w:t>
-      </w:r>
-      <w:proofErr w:type="spellEnd"/>
-      <w:r>
-        <w:rPr>
-          <w:rStyle w:val="Hyperlink"/>
-          <w:lang w:val="ru-RU"/>
-        </w:rPr>
-        <w:t>3</w:t>
-      </w:r>
-      <w:proofErr w:type="spellStart"/>
-      <w:r>
-        <w:rPr>
-          <w:rStyle w:val="Hyperlink"/>
-          <w:lang w:val="en-GB"/>
-        </w:rPr>
-        <w:t>Bggb</w:t>
-      </w:r>
-      <w:proofErr w:type="spellEnd"/>
-      <w:r>
-        <w:rPr>
-          <w:rStyle w:val="Hyperlink"/>
-          <w:lang w:val="ru-RU"/>
-        </w:rPr>
-        <w:t>/</w:t>
-      </w:r>
-      <w:r>
-        <w:rPr>
-          <w:rStyle w:val="Hyperlink"/>
-          <w:lang w:val="en-GB"/>
-        </w:rPr>
-        <w:t>view</w:t>
-      </w:r>
-      <w:r>
-        <w:rPr>
-          <w:rStyle w:val="Hyperlink"/>
-          <w:lang w:val="ru-RU"/>
-        </w:rPr>
-        <w:t>?</w:t>
-      </w:r>
-      <w:proofErr w:type="spellStart"/>
-      <w:r>
-        <w:rPr>
-          <w:rStyle w:val="Hyperlink"/>
-          <w:lang w:val="en-GB"/>
-        </w:rPr>
-        <w:t>usp</w:t>
-      </w:r>
-      <w:proofErr w:type="spellEnd"/>
-      <w:r>
-        <w:rPr>
-          <w:rStyle w:val="Hyperlink"/>
-          <w:lang w:val="ru-RU"/>
-        </w:rPr>
-        <w:t>=</w:t>
-      </w:r>
-      <w:r>
-        <w:rPr>
-          <w:rStyle w:val="Hyperlink"/>
-          <w:lang w:val="en-GB"/>
-        </w:rPr>
-        <w:t>sharing</w:t>
-      </w:r>
-      <w:r>
-        <w:fldChar w:fldCharType="end"/>
-      </w:r>
+      <w:hyperlink r:id="rId14" w:history="1">
+        <w:r>
+          <w:rPr>
+            <w:rStyle w:val="Hyperlink"/>
+            <w:lang w:val="en-GB"/>
+          </w:rPr>
+          <w:t>https</w:t>
+        </w:r>
+        <w:r>
+          <w:rPr>
+            <w:rStyle w:val="Hyperlink"/>
+            <w:lang w:val="ru-RU"/>
+          </w:rPr>
+          <w:t>://</w:t>
+        </w:r>
+        <w:r>
+          <w:rPr>
+            <w:rStyle w:val="Hyperlink"/>
+            <w:lang w:val="en-GB"/>
+          </w:rPr>
+          <w:t>drive</w:t>
+        </w:r>
+        <w:r>
+          <w:rPr>
+            <w:rStyle w:val="Hyperlink"/>
+            <w:lang w:val="ru-RU"/>
+          </w:rPr>
+          <w:t>.</w:t>
+        </w:r>
+        <w:r>
+          <w:rPr>
+            <w:rStyle w:val="Hyperlink"/>
+            <w:lang w:val="en-GB"/>
+          </w:rPr>
+          <w:t>google</w:t>
+        </w:r>
+        <w:r>
+          <w:rPr>
+            <w:rStyle w:val="Hyperlink"/>
+            <w:lang w:val="ru-RU"/>
+          </w:rPr>
+          <w:t>.</w:t>
+        </w:r>
+        <w:r>
+          <w:rPr>
+            <w:rStyle w:val="Hyperlink"/>
+            <w:lang w:val="en-GB"/>
+          </w:rPr>
+          <w:t>com</w:t>
+        </w:r>
+        <w:r>
+          <w:rPr>
+            <w:rStyle w:val="Hyperlink"/>
+            <w:lang w:val="ru-RU"/>
+          </w:rPr>
+          <w:t>/</w:t>
+        </w:r>
+        <w:r>
+          <w:rPr>
+            <w:rStyle w:val="Hyperlink"/>
+            <w:lang w:val="en-GB"/>
+          </w:rPr>
+          <w:t>file</w:t>
+        </w:r>
+        <w:r>
+          <w:rPr>
+            <w:rStyle w:val="Hyperlink"/>
+            <w:lang w:val="ru-RU"/>
+          </w:rPr>
+          <w:t>/</w:t>
+        </w:r>
+        <w:r>
+          <w:rPr>
+            <w:rStyle w:val="Hyperlink"/>
+            <w:lang w:val="en-GB"/>
+          </w:rPr>
+          <w:t>d</w:t>
+        </w:r>
+        <w:r>
+          <w:rPr>
+            <w:rStyle w:val="Hyperlink"/>
+            <w:lang w:val="ru-RU"/>
+          </w:rPr>
+          <w:t>/1</w:t>
+        </w:r>
+        <w:proofErr w:type="spellStart"/>
+        <w:r>
+          <w:rPr>
+            <w:rStyle w:val="Hyperlink"/>
+            <w:lang w:val="en-GB"/>
+          </w:rPr>
+          <w:t>hvcU</w:t>
+        </w:r>
+        <w:proofErr w:type="spellEnd"/>
+        <w:r>
+          <w:rPr>
+            <w:rStyle w:val="Hyperlink"/>
+            <w:lang w:val="ru-RU"/>
+          </w:rPr>
+          <w:t>88</w:t>
+        </w:r>
+        <w:proofErr w:type="spellStart"/>
+        <w:r>
+          <w:rPr>
+            <w:rStyle w:val="Hyperlink"/>
+            <w:lang w:val="en-GB"/>
+          </w:rPr>
+          <w:t>JyLGeU</w:t>
+        </w:r>
+        <w:proofErr w:type="spellEnd"/>
+        <w:r>
+          <w:rPr>
+            <w:rStyle w:val="Hyperlink"/>
+            <w:lang w:val="ru-RU"/>
+          </w:rPr>
+          <w:t>65</w:t>
+        </w:r>
+        <w:r>
+          <w:rPr>
+            <w:rStyle w:val="Hyperlink"/>
+            <w:lang w:val="en-GB"/>
+          </w:rPr>
+          <w:t>K</w:t>
+        </w:r>
+        <w:r>
+          <w:rPr>
+            <w:rStyle w:val="Hyperlink"/>
+            <w:lang w:val="ru-RU"/>
+          </w:rPr>
+          <w:t>9</w:t>
+        </w:r>
+        <w:r>
+          <w:rPr>
+            <w:rStyle w:val="Hyperlink"/>
+            <w:lang w:val="en-GB"/>
+          </w:rPr>
+          <w:t>t</w:t>
+        </w:r>
+        <w:r>
+          <w:rPr>
+            <w:rStyle w:val="Hyperlink"/>
+            <w:lang w:val="ru-RU"/>
+          </w:rPr>
+          <w:t>6</w:t>
+        </w:r>
+        <w:r>
+          <w:rPr>
+            <w:rStyle w:val="Hyperlink"/>
+            <w:lang w:val="en-GB"/>
+          </w:rPr>
+          <w:t>Lo</w:t>
+        </w:r>
+        <w:r>
+          <w:rPr>
+            <w:rStyle w:val="Hyperlink"/>
+            <w:lang w:val="ru-RU"/>
+          </w:rPr>
+          <w:t>-</w:t>
+        </w:r>
+        <w:proofErr w:type="spellStart"/>
+        <w:r>
+          <w:rPr>
+            <w:rStyle w:val="Hyperlink"/>
+            <w:lang w:val="en-GB"/>
+          </w:rPr>
+          <w:t>czU</w:t>
+        </w:r>
+        <w:proofErr w:type="spellEnd"/>
+        <w:r>
+          <w:rPr>
+            <w:rStyle w:val="Hyperlink"/>
+            <w:lang w:val="ru-RU"/>
+          </w:rPr>
+          <w:t>3</w:t>
+        </w:r>
+        <w:proofErr w:type="spellStart"/>
+        <w:r>
+          <w:rPr>
+            <w:rStyle w:val="Hyperlink"/>
+            <w:lang w:val="en-GB"/>
+          </w:rPr>
+          <w:t>rQ</w:t>
+        </w:r>
+        <w:proofErr w:type="spellEnd"/>
+        <w:r>
+          <w:rPr>
+            <w:rStyle w:val="Hyperlink"/>
+            <w:lang w:val="ru-RU"/>
+          </w:rPr>
+          <w:t>3</w:t>
+        </w:r>
+        <w:proofErr w:type="spellStart"/>
+        <w:r>
+          <w:rPr>
+            <w:rStyle w:val="Hyperlink"/>
+            <w:lang w:val="en-GB"/>
+          </w:rPr>
+          <w:t>Bggb</w:t>
+        </w:r>
+        <w:proofErr w:type="spellEnd"/>
+        <w:r>
+          <w:rPr>
+            <w:rStyle w:val="Hyperlink"/>
+            <w:lang w:val="ru-RU"/>
+          </w:rPr>
+          <w:t>/</w:t>
+        </w:r>
+        <w:r>
+          <w:rPr>
+            <w:rStyle w:val="Hyperlink"/>
+            <w:lang w:val="en-GB"/>
+          </w:rPr>
+          <w:t>view</w:t>
+        </w:r>
+        <w:r>
+          <w:rPr>
+            <w:rStyle w:val="Hyperlink"/>
+            <w:lang w:val="ru-RU"/>
+          </w:rPr>
+          <w:t>?</w:t>
+        </w:r>
+        <w:proofErr w:type="spellStart"/>
+        <w:r>
+          <w:rPr>
+            <w:rStyle w:val="Hyperlink"/>
+            <w:lang w:val="en-GB"/>
+          </w:rPr>
+          <w:t>usp</w:t>
+        </w:r>
+        <w:proofErr w:type="spellEnd"/>
+        <w:r>
+          <w:rPr>
+            <w:rStyle w:val="Hyperlink"/>
+            <w:lang w:val="ru-RU"/>
+          </w:rPr>
+          <w:t>=</w:t>
+        </w:r>
+        <w:r>
+          <w:rPr>
+            <w:rStyle w:val="Hyperlink"/>
+            <w:lang w:val="en-GB"/>
+          </w:rPr>
+          <w:t>sharing</w:t>
+        </w:r>
+      </w:hyperlink>
     </w:p>
     <w:p>
       <w:pPr>
@@ -5655,8 +5645,8 @@
       </w:pPr>
     </w:p>
     <w:sectPr>
-      <w:headerReference w:type="default" r:id="rId14"/>
-      <w:headerReference w:type="first" r:id="rId15"/>
+      <w:headerReference w:type="default" r:id="rId15"/>
+      <w:headerReference w:type="first" r:id="rId16"/>
       <w:type w:val="continuous"/>
       <w:pgSz w:w="11906" w:h="16838"/>
       <w:pgMar w:top="567" w:right="567" w:bottom="1418" w:left="1418" w:header="709" w:footer="709" w:gutter="0"/>

</xml_diff>